<commit_message>
Stage 8 review fixes: A-028
</commit_message>
<xml_diff>
--- a/output/archive/Archive/Users/cantoine_old_laptop/Notes/2019/chemistry_notes_v3.docx
+++ b/output/archive/Archive/Users/cantoine_old_laptop/Notes/2019/chemistry_notes_v3.docx
@@ -55,7 +55,7 @@
     </w:p>
     <w:p>
       <w:r>
-        <w:t>This note compares the small-scale work-ups we have used for the coupling trials over the spring. It is a working draft and several sections are incomplete.</w:t>
+        <w:t>This note compares candidate small-scale work-ups for coupling trials. It is a working draft and several sections are incomplete; trial observations remain in the bench records.</w:t>
       </w:r>
     </w:p>
     <w:p>
@@ -78,18 +78,18 @@
     </w:p>
     <w:p>
       <w:r>
-        <w:t xml:space="preserve">The quench and extraction steps differ between the three work-ups. Work-up A uses saturated sodium bicarbonate and ethyl acetate; work-up B uses water and dichloromethane; </w:t>
+        <w:t xml:space="preserve">For comparison, work-up A uses saturated sodium bicarbonate and ethyl acetate; work-up B uses water and dichloromethane; </w:t>
       </w:r>
       <w:r>
         <w:t xml:space="preserve">work-up C is a direct evaporation with a silica plug</w:t>
       </w:r>
-      <w:ins w:id="85771" w:author="Ruth Calderwood" w:date="2019-06-20T09:00:00Z">
+      <w:ins w:id="85771" w:author="Ruth Calderwood" w:date="2019-06-19T09:00:00Z">
         <w:r>
           <w:t xml:space="preserve">work-up C is a direct evaporation onto a silica plug</w:t>
         </w:r>
       </w:ins>
       <w:r>
-        <w:t xml:space="preserve">.</w:t>
+        <w:t xml:space="preserve">. These are candidate protocols, not a record of confirmed outcomes.</w:t>
       </w:r>
     </w:p>
     <w:p>
@@ -291,7 +291,7 @@
               <w:rPr>
                 <w:sz w:val="18"/>
               </w:rPr>
-              <w:t>Emulsion on larger scale</w:t>
+              <w:t>Check emulsion risk at larger scale</w:t>
             </w:r>
           </w:p>
         </w:tc>
@@ -373,7 +373,7 @@
               <w:rPr>
                 <w:sz w:val="18"/>
               </w:rPr>
-              <w:t>Clean phase split; DCM recovery needed</w:t>
+              <w:t>Phase split and solvent recovery to be assessed</w:t>
             </w:r>
           </w:p>
         </w:tc>
@@ -440,7 +440,7 @@
               <w:rPr>
                 <w:sz w:val="18"/>
               </w:rPr>
-              <w:t>Silica plug removes most baseline material</w:t>
+              <w:t>Removal of impurities to be assessed</w:t>
             </w:r>
           </w:p>
         </w:tc>
@@ -449,7 +449,7 @@
     <w:p/>
     <w:p>
       <w:r>
-        <w:t>Work-up B gives the cleanest phase split. It also uses the most solvent, and the DCM goes to the halogenated waste stream unless it is recovered.</w:t>
+        <w:t>Phase separation and solvent demand must be compared using the bench records before a work-up is preferred. Chlorinated solvent requires the appropriate waste stream unless an approved recovery procedure is used.</w:t>
       </w:r>
     </w:p>
     <w:p>
@@ -459,7 +459,7 @@
         <w:keepLines/>
       </w:pPr>
       <w:r>
-        <w:t>Yield and purity to be added once the trial HPLC runs are back</w:t>
+        <w:t>Yield and purity to be checked against the trial records</w:t>
       </w:r>
     </w:p>
     <w:p>
@@ -468,7 +468,7 @@
         <w:keepLines/>
       </w:pPr>
       <w:r>
-        <w:t>Work-up C not yet run at the larger scale</w:t>
+        <w:t>Larger-scale suitability of work-up C remains open</w:t>
       </w:r>
     </w:p>
     <w:p>
@@ -477,12 +477,12 @@
         <w:keepNext/>
       </w:pPr>
       <w:r>
-        <w:t>3 Concentrations</w:t>
+        <w:t>3 Quantities and units</w:t>
       </w:r>
     </w:p>
     <w:p>
       <w:r>
-        <w:t>Stock solutions were made at 10 mM in DMSO. Working solutions for the assay were 50 µM in buffer, with a top concentration of 10 µM in the dose plate.</w:t>
+        <w:t>Transfer reagent charges and isolated masses from the bench sheet with their original units. The typed sheet uses mg; handwritten entries may use g. Keep both visible until the conversion is checked.</w:t>
       </w:r>
     </w:p>
     <w:p>
@@ -490,12 +490,12 @@
         <w:rPr>
           <w:sz w:val="17"/>
         </w:rPr>
-        <w:t>In the bench sheet the working solution is written as 50 nM in one place, while the protocol says 50 µM. Check the sheet before the next run.</w:t>
+        <w:t>Do not treat isolated mass as percentage yield. Calculation requires the limiting reagent and the assigned product structure. Entries awaiting reconciliation remain [TBC].</w:t>
       </w:r>
     </w:p>
     <w:p>
       <w:r>
-        <w:t>Solubility of the crude products was checked at 5 mg/mL and 5 mg/ml in two different batches of DMSO and recorded without comparison.</w:t>
+        <w:t>Solvent volumes and recovery quantities are to be taken from the work-up records. No recovery recommendation is agreed here.</w:t>
       </w:r>
     </w:p>
     <w:p>
@@ -509,14 +509,14 @@
     </w:p>
     <w:p>
       <w:r>
-        <w:t xml:space="preserve">Solvent recovery from the ethyl acetate washes is still undecided. The rotary evaporator in the back room is booked for the mixed-solvent fractions, </w:t>
+        <w:t xml:space="preserve">Solvent recovery from the ethyl acetate washes is still undecided. Confirm the equipment and waste-stream arrangements before deciding whether recovery is practical, </w:t>
       </w:r>
       <w:r>
         <w:t xml:space="preserve">so the washes may need to go to the waste stream</w:t>
       </w:r>
-      <w:ins w:id="89763" w:author="Ruth Calderwood" w:date="2019-06-20T09:00:00Z">
+      <w:ins w:id="89763" w:author="Ruth Calderwood" w:date="2019-06-19T09:00:00Z">
         <w:r>
-          <w:t xml:space="preserve">, unless the bump trap is fitted first</w:t>
+          <w:t xml:space="preserve">; recovery requires an approved procedure first</w:t>
         </w:r>
       </w:ins>
       <w:r>
@@ -529,7 +529,7 @@
           <w:i/>
           <w:sz w:val="18"/>
         </w:rPr>
-        <w:t>Ask facilities whether the bump trap is fitted on the second unit. Until that is answered, do not plan recovery runs for the larger scale.</w:t>
+        <w:t>Ask facilities to confirm the recovery setup and approved procedure. A bump trap alone does not establish that a mixed solvent can be safely recovered for reuse.</w:t>
       </w:r>
     </w:p>
     <w:p>
@@ -545,7 +545,7 @@
       <w:r>
         <w:t xml:space="preserve">Which work-up goes forward for the scale-up? </w:t>
       </w:r>
-      <w:del w:id="87999" w:author="Clara Fenwick" w:date="2019-06-21T09:00:00Z">
+      <w:del w:id="87999" w:author="Clara Fenwick" w:date="2019-06-19T09:00:00Z">
         <w:r>
           <w:delText xml:space="preserve">This is still open.</w:delText>
         </w:r>

</xml_diff>